<commit_message>
De-brand solution documents (white-label) + rebuild/republish
Remove the "Phoenixtekk" reference from all 49 affected solution
documents (source, scripts, listing, README) with white-label
replacements, and flip the 20 intentionally-branded solutions to
branding:off so the compiler/hero/wiki stop stamping the name on
cover, footer, and page description.

- Rebuilt all 49 deliverables (PDF/Word/scripts ZIP) and hero images
  white-label; refreshed the _deliverables shelf.
- Re-seeded wiki learning baselines from the republished (clean) pages.
- Normalized com.phoenixtekk.* payload identifiers to com.example.*.

Verified zero "Phoenixtekk" in solution source, compiled deliverables,
live store product text, and live wiki content. Membership tiers,
support add-ons, and the WinAppTool product line keep their intentional
branding (not solution documents).

Co-Authored-By: Claude Opus 4.8 <noreply@anthropic.com>
</commit_message>
<xml_diff>
--- a/library/_deliverables/application-control-wdac/WDAC-Solution.docx
+++ b/library/_deliverables/application-control-wdac/WDAC-Solution.docx
@@ -15,32 +15,6 @@
       <w:r>
         <w:rPr>
           <w:b/>
-          <w:color w:val="1F3A5F"/>
-          <w:sz w:val="52"/>
-        </w:rPr>
-        <w:t>PHOENIXTEKK</w:t>
-      </w:r>
-    </w:p>
-    <w:p>
-      <w:pPr>
-        <w:jc w:val="center"/>
-      </w:pPr>
-      <w:r>
-        <w:rPr>
-          <w:color w:val="2E86C1"/>
-          <w:sz w:val="24"/>
-        </w:rPr>
-        <w:t>Workplace Marketplace · Intune Solutions</w:t>
-      </w:r>
-    </w:p>
-    <w:p/>
-    <w:p>
-      <w:pPr>
-        <w:jc w:val="center"/>
-      </w:pPr>
-      <w:r>
-        <w:rPr>
-          <w:b/>
           <w:sz w:val="40"/>
         </w:rPr>
         <w:t>Application Control (WDAC)</w:t>
@@ -75,8 +49,6 @@
           <w:sz w:val="20"/>
         </w:rPr>
         <w:t>Version 1.0.0    ·    2026-06-14</w:t>
-        <w:br/>
-        <w:t>Phoenixtekk · workplace.phoenixtekk.com</w:t>
       </w:r>
     </w:p>
     <w:p>
@@ -119,7 +91,7 @@
         <w:rPr>
           <w:b/>
         </w:rPr>
-        <w:t>Phoenixtekk Workplace Marketplace · Intune Solutions</w:t>
+        <w:t>White-label · Intune Solutions</w:t>
       </w:r>
     </w:p>
     <w:p>
@@ -330,7 +302,7 @@
         <w:pStyle w:val="Heading2"/>
       </w:pPr>
       <w:r>
-        <w:t>The Phoenixtekk deployment model</w:t>
+        <w:t>The standard deployment model</w:t>
       </w:r>
     </w:p>
     <w:p>
@@ -717,7 +689,7 @@
         <w:pStyle w:val="Heading2"/>
       </w:pPr>
       <w:r>
-        <w:t>The standard Phoenixtekk deployment model</w:t>
+        <w:t>The standard deployment model</w:t>
       </w:r>
     </w:p>
     <w:p>
@@ -729,7 +701,7 @@
           <w:i/>
           <w:color w:val="2E86C1"/>
         </w:rPr>
-        <w:t>Create the App Control policy in Audit → review Code Integrity events → add trust → Enforce → expand. Phoenixtekk pattern: Assess → Configure → Pilot → Validate → Expand.</w:t>
+        <w:t>Create the App Control policy in Audit → review Code Integrity events → add trust → Enforce → expand. repeatable pattern: Assess → Configure → Pilot → Validate → Expand.</w:t>
       </w:r>
     </w:p>
     <w:p>
@@ -876,9 +848,10 @@
       </w:r>
       <w:r>
         <w:rPr>
-          <w:b/>
+          <w:rFonts w:ascii="Consolas" w:hAnsi="Consolas"/>
+          <w:sz w:val="19"/>
         </w:rPr>
-        <w:t>`WDAC-Discovery.ps1`</w:t>
+        <w:t>WDAC-Discovery.ps1</w:t>
       </w:r>
       <w:r>
         <w:t xml:space="preserve">. </w:t>
@@ -986,9 +959,10 @@
       </w:r>
       <w:r>
         <w:rPr>
-          <w:b/>
+          <w:rFonts w:ascii="Consolas" w:hAnsi="Consolas"/>
+          <w:sz w:val="19"/>
         </w:rPr>
-        <w:t>`WDAC-AuditReport.ps1`</w:t>
+        <w:t>WDAC-AuditReport.ps1</w:t>
       </w:r>
       <w:r>
         <w:t xml:space="preserve"> output during the audit phase. </w:t>
@@ -1105,9 +1079,10 @@
       </w:r>
       <w:r>
         <w:rPr>
-          <w:b/>
+          <w:rFonts w:ascii="Consolas" w:hAnsi="Consolas"/>
+          <w:sz w:val="19"/>
         </w:rPr>
-        <w:t>`WDAC-Remediation.ps1`</w:t>
+        <w:t>WDAC-Remediation.ps1</w:t>
       </w:r>
       <w:r>
         <w:t xml:space="preserve"> (policy-removal path) and an Intune unassign procedure. </w:t>
@@ -1217,7 +1192,7 @@
         <w:t>every</w:t>
       </w:r>
       <w:r>
-        <w:t xml:space="preserve"> Phoenixtekk solution in the </w:t>
+        <w:t xml:space="preserve"> solution in the </w:t>
       </w:r>
       <w:r>
         <w:rPr>
@@ -1527,7 +1502,7 @@
         <w:t>Why:</w:t>
       </w:r>
       <w:r>
-        <w:t xml:space="preserve"> Every Phoenixtekk solution is piloted before fleet rollout. </w:t>
+        <w:t xml:space="preserve"> Every solution is piloted before fleet rollout. </w:t>
       </w:r>
       <w:r>
         <w:rPr>
@@ -1725,7 +1700,7 @@
         <w:rPr>
           <w:b/>
         </w:rPr>
-        <w:t>The Phoenixtekk deployment model (all solutions):</w:t>
+        <w:t>The standard deployment model (all solutions):</w:t>
       </w:r>
       <w:r>
         <w:t xml:space="preserve"> </w:t>
@@ -2191,9 +2166,10 @@
       </w:r>
       <w:r>
         <w:rPr>
-          <w:b/>
+          <w:rFonts w:ascii="Consolas" w:hAnsi="Consolas"/>
+          <w:sz w:val="19"/>
         </w:rPr>
-        <w:t>`WDAC-AuditReport.ps1`</w:t>
+        <w:t>WDAC-AuditReport.ps1</w:t>
       </w:r>
       <w:r>
         <w:t xml:space="preserve"> (reads Code Integrity audit events 3076).</w:t>
@@ -2328,9 +2304,10 @@
       </w:r>
       <w:r>
         <w:rPr>
-          <w:b/>
+          <w:rFonts w:ascii="Consolas" w:hAnsi="Consolas"/>
+          <w:sz w:val="19"/>
         </w:rPr>
-        <w:t>`WDAC-Validation.ps1`</w:t>
+        <w:t>WDAC-Validation.ps1</w:t>
       </w:r>
       <w:r>
         <w:t xml:space="preserve"> (confirms an enforced policy is active).</w:t>
@@ -2395,18 +2372,20 @@
       </w:r>
       <w:r>
         <w:rPr>
-          <w:b/>
+          <w:rFonts w:ascii="Consolas" w:hAnsi="Consolas"/>
+          <w:sz w:val="19"/>
         </w:rPr>
-        <w:t>`WDAC-Validation.ps1`</w:t>
+        <w:t>WDAC-Validation.ps1</w:t>
       </w:r>
       <w:r>
         <w:t xml:space="preserve"> / </w:t>
       </w:r>
       <w:r>
         <w:rPr>
-          <w:b/>
+          <w:rFonts w:ascii="Consolas" w:hAnsi="Consolas"/>
+          <w:sz w:val="19"/>
         </w:rPr>
-        <w:t>`WDAC-AuditReport.ps1`</w:t>
+        <w:t>WDAC-AuditReport.ps1</w:t>
       </w:r>
       <w:r>
         <w:t>.</w:t>
@@ -2855,36 +2834,40 @@
       </w:r>
       <w:r>
         <w:rPr>
-          <w:b/>
+          <w:rFonts w:ascii="Consolas" w:hAnsi="Consolas"/>
+          <w:sz w:val="19"/>
         </w:rPr>
-        <w:t>`WDAC-Validation.ps1`</w:t>
+        <w:t>WDAC-Validation.ps1</w:t>
       </w:r>
       <w:r>
         <w:t xml:space="preserve"> / </w:t>
       </w:r>
       <w:r>
         <w:rPr>
-          <w:b/>
+          <w:rFonts w:ascii="Consolas" w:hAnsi="Consolas"/>
+          <w:sz w:val="19"/>
         </w:rPr>
-        <w:t>`WDAC-Discovery.ps1`</w:t>
+        <w:t>WDAC-Discovery.ps1</w:t>
       </w:r>
       <w:r>
         <w:t xml:space="preserve"> for policy state and </w:t>
       </w:r>
       <w:r>
         <w:rPr>
-          <w:b/>
+          <w:rFonts w:ascii="Consolas" w:hAnsi="Consolas"/>
+          <w:sz w:val="19"/>
         </w:rPr>
-        <w:t>`WDAC-AuditReport.ps1`</w:t>
+        <w:t>WDAC-AuditReport.ps1</w:t>
       </w:r>
       <w:r>
         <w:t xml:space="preserve"> for events, </w:t>
       </w:r>
       <w:r>
         <w:rPr>
-          <w:b/>
+          <w:rFonts w:ascii="Consolas" w:hAnsi="Consolas"/>
+          <w:sz w:val="19"/>
         </w:rPr>
-        <w:t>`WDAC-Remediation.ps1`</w:t>
+        <w:t>WDAC-Remediation.ps1</w:t>
       </w:r>
       <w:r>
         <w:t xml:space="preserve"> for recovery.</w:t>
@@ -3074,9 +3057,10 @@
       </w:r>
       <w:r>
         <w:rPr>
-          <w:b/>
+          <w:rFonts w:ascii="Consolas" w:hAnsi="Consolas"/>
+          <w:sz w:val="19"/>
         </w:rPr>
-        <w:t>`WDAC-Remediation.ps1`</w:t>
+        <w:t>WDAC-Remediation.ps1</w:t>
       </w:r>
       <w:r>
         <w:t xml:space="preserve"> to clear/refresh the local policy and force a sync.</w:t>
@@ -3921,7 +3905,7 @@
         <w:pStyle w:val="ListBullet"/>
       </w:pPr>
       <w:r>
-        <w:t xml:space="preserve">A repeatable process following the Phoenixtekk model: </w:t>
+        <w:t xml:space="preserve">A repeatable process following the repeatable model: </w:t>
       </w:r>
       <w:r>
         <w:rPr>

</xml_diff>